<commit_message>
add plausible analytics, docs cleanup
</commit_message>
<xml_diff>
--- a/docs/orcapelago-devops.docx
+++ b/docs/orcapelago-devops.docx
@@ -224,12 +224,14 @@
         </w:rPr>
         <w:t xml:space="preserve"> record to brightrain.com DNS for </w:t>
       </w:r>
+      <w:proofErr w:type="spellStart"/>
       <w:r>
         <w:rPr>
           <w:rFonts w:ascii="Aptos" w:eastAsia="Aptos" w:hAnsi="Aptos" w:cs="Aptos"/>
         </w:rPr>
         <w:t>orcapelago</w:t>
       </w:r>
+      <w:proofErr w:type="spellEnd"/>
       <w:r>
         <w:rPr>
           <w:rFonts w:ascii="Aptos" w:eastAsia="Aptos" w:hAnsi="Aptos" w:cs="Aptos"/>
@@ -357,7 +359,21 @@
         <w:rPr>
           <w:rFonts w:ascii="Aptos" w:eastAsia="Aptos" w:hAnsi="Aptos" w:cs="Aptos"/>
         </w:rPr>
-        <w:t>Netlify workflow that pulls the latest from the Github repo on push to main</w:t>
+        <w:t xml:space="preserve">Netlify workflow that pulls the latest from the </w:t>
+      </w:r>
+      <w:proofErr w:type="spellStart"/>
+      <w:r>
+        <w:rPr>
+          <w:rFonts w:ascii="Aptos" w:eastAsia="Aptos" w:hAnsi="Aptos" w:cs="Aptos"/>
+        </w:rPr>
+        <w:t>Github</w:t>
+      </w:r>
+      <w:proofErr w:type="spellEnd"/>
+      <w:r>
+        <w:rPr>
+          <w:rFonts w:ascii="Aptos" w:eastAsia="Aptos" w:hAnsi="Aptos" w:cs="Aptos"/>
+        </w:rPr>
+        <w:t xml:space="preserve"> repo on push to main</w:t>
       </w:r>
       <w:r>
         <w:rPr>
@@ -393,7 +409,35 @@
         <w:rPr>
           <w:rFonts w:ascii="Aptos" w:eastAsia="Aptos" w:hAnsi="Aptos" w:cs="Aptos"/>
         </w:rPr>
-        <w:t>Vue 3 app using Vite for build etc. All the bells and whistles. Using Netlify server(less) functions for our API so we have some Netlify environment variables setup too. Also using the Netlify CLI to run those functions during dev.</w:t>
+        <w:t xml:space="preserve">Vue 3 app using Vite for build etc. All the bells and whistles. Using Netlify server(less) functions for our API so we have some Netlify environment variables </w:t>
+      </w:r>
+      <w:proofErr w:type="gramStart"/>
+      <w:r>
+        <w:rPr>
+          <w:rFonts w:ascii="Aptos" w:eastAsia="Aptos" w:hAnsi="Aptos" w:cs="Aptos"/>
+        </w:rPr>
+        <w:t>setup</w:t>
+      </w:r>
+      <w:proofErr w:type="gramEnd"/>
+      <w:r>
+        <w:rPr>
+          <w:rFonts w:ascii="Aptos" w:eastAsia="Aptos" w:hAnsi="Aptos" w:cs="Aptos"/>
+        </w:rPr>
+        <w:t xml:space="preserve"> too. Also using </w:t>
+      </w:r>
+      <w:proofErr w:type="gramStart"/>
+      <w:r>
+        <w:rPr>
+          <w:rFonts w:ascii="Aptos" w:eastAsia="Aptos" w:hAnsi="Aptos" w:cs="Aptos"/>
+        </w:rPr>
+        <w:t>the Netlify</w:t>
+      </w:r>
+      <w:proofErr w:type="gramEnd"/>
+      <w:r>
+        <w:rPr>
+          <w:rFonts w:ascii="Aptos" w:eastAsia="Aptos" w:hAnsi="Aptos" w:cs="Aptos"/>
+        </w:rPr>
+        <w:t xml:space="preserve"> CLI to run those functions during dev.</w:t>
       </w:r>
     </w:p>
     <w:p>
@@ -416,7 +460,28 @@
         <w:rPr>
           <w:rFonts w:ascii="Aptos" w:eastAsia="Aptos" w:hAnsi="Aptos" w:cs="Aptos"/>
         </w:rPr>
-        <w:t>Using OpenFreeMap, OpenWater</w:t>
+        <w:t xml:space="preserve">Using </w:t>
+      </w:r>
+      <w:proofErr w:type="spellStart"/>
+      <w:r>
+        <w:rPr>
+          <w:rFonts w:ascii="Aptos" w:eastAsia="Aptos" w:hAnsi="Aptos" w:cs="Aptos"/>
+        </w:rPr>
+        <w:t>OpenFreeMap</w:t>
+      </w:r>
+      <w:proofErr w:type="spellEnd"/>
+      <w:r>
+        <w:rPr>
+          <w:rFonts w:ascii="Aptos" w:eastAsia="Aptos" w:hAnsi="Aptos" w:cs="Aptos"/>
+        </w:rPr>
+        <w:t xml:space="preserve">, </w:t>
+      </w:r>
+      <w:proofErr w:type="spellStart"/>
+      <w:r>
+        <w:rPr>
+          <w:rFonts w:ascii="Aptos" w:eastAsia="Aptos" w:hAnsi="Aptos" w:cs="Aptos"/>
+        </w:rPr>
+        <w:t>OpenWater</w:t>
       </w:r>
       <w:r>
         <w:rPr>
@@ -424,24 +489,67 @@
         </w:rPr>
         <w:t>s</w:t>
       </w:r>
-      <w:r>
-        <w:rPr>
-          <w:rFonts w:ascii="Aptos" w:eastAsia="Aptos" w:hAnsi="Aptos" w:cs="Aptos"/>
-        </w:rPr>
-        <w:t xml:space="preserve"> and Esri imagery but no api keys required</w:t>
-      </w:r>
-    </w:p>
-    <w:p>
-      <w:pPr>
-        <w:rPr>
-          <w:rFonts w:ascii="Aptos" w:eastAsia="Aptos" w:hAnsi="Aptos" w:cs="Aptos"/>
-        </w:rPr>
-      </w:pPr>
-      <w:r>
-        <w:rPr>
-          <w:rFonts w:ascii="Aptos" w:eastAsia="Aptos" w:hAnsi="Aptos" w:cs="Aptos"/>
-        </w:rPr>
-        <w:t>Note the admin features are gated by the Admin token that is stored in our local .env and on Netlify as an environment variable in the Orcapelago project.</w:t>
+      <w:proofErr w:type="spellEnd"/>
+      <w:r>
+        <w:rPr>
+          <w:rFonts w:ascii="Aptos" w:eastAsia="Aptos" w:hAnsi="Aptos" w:cs="Aptos"/>
+        </w:rPr>
+        <w:t xml:space="preserve"> and Esri imagery but no </w:t>
+      </w:r>
+      <w:proofErr w:type="spellStart"/>
+      <w:r>
+        <w:rPr>
+          <w:rFonts w:ascii="Aptos" w:eastAsia="Aptos" w:hAnsi="Aptos" w:cs="Aptos"/>
+        </w:rPr>
+        <w:t>api</w:t>
+      </w:r>
+      <w:proofErr w:type="spellEnd"/>
+      <w:r>
+        <w:rPr>
+          <w:rFonts w:ascii="Aptos" w:eastAsia="Aptos" w:hAnsi="Aptos" w:cs="Aptos"/>
+        </w:rPr>
+        <w:t xml:space="preserve"> keys required</w:t>
+      </w:r>
+    </w:p>
+    <w:p>
+      <w:pPr>
+        <w:rPr>
+          <w:rFonts w:ascii="Aptos" w:eastAsia="Aptos" w:hAnsi="Aptos" w:cs="Aptos"/>
+        </w:rPr>
+      </w:pPr>
+      <w:r>
+        <w:rPr>
+          <w:rFonts w:ascii="Aptos" w:eastAsia="Aptos" w:hAnsi="Aptos" w:cs="Aptos"/>
+        </w:rPr>
+        <w:t xml:space="preserve">Note the admin features are gated by the Admin token that is stored in our </w:t>
+      </w:r>
+      <w:proofErr w:type="gramStart"/>
+      <w:r>
+        <w:rPr>
+          <w:rFonts w:ascii="Aptos" w:eastAsia="Aptos" w:hAnsi="Aptos" w:cs="Aptos"/>
+        </w:rPr>
+        <w:t>local .env</w:t>
+      </w:r>
+      <w:proofErr w:type="gramEnd"/>
+      <w:r>
+        <w:rPr>
+          <w:rFonts w:ascii="Aptos" w:eastAsia="Aptos" w:hAnsi="Aptos" w:cs="Aptos"/>
+        </w:rPr>
+        <w:t xml:space="preserve"> and on Netlify as an environment variable in the </w:t>
+      </w:r>
+      <w:proofErr w:type="spellStart"/>
+      <w:r>
+        <w:rPr>
+          <w:rFonts w:ascii="Aptos" w:eastAsia="Aptos" w:hAnsi="Aptos" w:cs="Aptos"/>
+        </w:rPr>
+        <w:t>Orcapelago</w:t>
+      </w:r>
+      <w:proofErr w:type="spellEnd"/>
+      <w:r>
+        <w:rPr>
+          <w:rFonts w:ascii="Aptos" w:eastAsia="Aptos" w:hAnsi="Aptos" w:cs="Aptos"/>
+        </w:rPr>
+        <w:t xml:space="preserve"> project.</w:t>
       </w:r>
     </w:p>
     <w:p>
@@ -491,7 +599,21 @@
         <w:rPr>
           <w:rFonts w:ascii="Aptos" w:eastAsia="Aptos" w:hAnsi="Aptos" w:cs="Aptos"/>
         </w:rPr>
-        <w:t xml:space="preserve"> locally in .env for dev and as environment variables on Netlify</w:t>
+        <w:t xml:space="preserve"> locally </w:t>
+      </w:r>
+      <w:proofErr w:type="gramStart"/>
+      <w:r>
+        <w:rPr>
+          <w:rFonts w:ascii="Aptos" w:eastAsia="Aptos" w:hAnsi="Aptos" w:cs="Aptos"/>
+        </w:rPr>
+        <w:t>in .env</w:t>
+      </w:r>
+      <w:proofErr w:type="gramEnd"/>
+      <w:r>
+        <w:rPr>
+          <w:rFonts w:ascii="Aptos" w:eastAsia="Aptos" w:hAnsi="Aptos" w:cs="Aptos"/>
+        </w:rPr>
+        <w:t xml:space="preserve"> for dev and as environment variables on Netlify</w:t>
       </w:r>
     </w:p>
     <w:p>
@@ -528,7 +650,21 @@
         <w:rPr>
           <w:rFonts w:ascii="Aptos" w:eastAsia="Aptos" w:hAnsi="Aptos" w:cs="Aptos"/>
         </w:rPr>
-        <w:t xml:space="preserve"> locally in .env for dev and as environment variables on Netlify</w:t>
+        <w:t xml:space="preserve"> locally </w:t>
+      </w:r>
+      <w:proofErr w:type="gramStart"/>
+      <w:r>
+        <w:rPr>
+          <w:rFonts w:ascii="Aptos" w:eastAsia="Aptos" w:hAnsi="Aptos" w:cs="Aptos"/>
+        </w:rPr>
+        <w:t>in .env</w:t>
+      </w:r>
+      <w:proofErr w:type="gramEnd"/>
+      <w:r>
+        <w:rPr>
+          <w:rFonts w:ascii="Aptos" w:eastAsia="Aptos" w:hAnsi="Aptos" w:cs="Aptos"/>
+        </w:rPr>
+        <w:t xml:space="preserve"> for dev and as environment variables on Netlify</w:t>
       </w:r>
     </w:p>
     <w:p>
@@ -570,7 +706,68 @@
         <w:rPr>
           <w:rFonts w:ascii="Aptos" w:eastAsia="Aptos" w:hAnsi="Aptos" w:cs="Aptos"/>
         </w:rPr>
-        <w:t>The ingest process was initially built to be run through the admin on the app itself. However this was changed to the ingest process running only locally via the terminal (to eliminate the overhead of the web app and keep the anthropic api key that costs real money) out of the web app.</w:t>
+        <w:t xml:space="preserve">The ingest process was initially built to be run through the admin on the app itself. </w:t>
+      </w:r>
+      <w:proofErr w:type="gramStart"/>
+      <w:r>
+        <w:rPr>
+          <w:rFonts w:ascii="Aptos" w:eastAsia="Aptos" w:hAnsi="Aptos" w:cs="Aptos"/>
+        </w:rPr>
+        <w:t>However</w:t>
+      </w:r>
+      <w:proofErr w:type="gramEnd"/>
+      <w:r>
+        <w:rPr>
+          <w:rFonts w:ascii="Aptos" w:eastAsia="Aptos" w:hAnsi="Aptos" w:cs="Aptos"/>
+        </w:rPr>
+        <w:t xml:space="preserve"> this was changed to the ingest process running only locally via the terminal (to eliminate the overhead </w:t>
+      </w:r>
+      <w:r>
+        <w:rPr>
+          <w:rFonts w:ascii="Aptos" w:eastAsia="Aptos" w:hAnsi="Aptos" w:cs="Aptos"/>
+        </w:rPr>
+        <w:lastRenderedPageBreak/>
+        <w:t xml:space="preserve">of the web app and keep the anthropic </w:t>
+      </w:r>
+      <w:proofErr w:type="spellStart"/>
+      <w:r>
+        <w:rPr>
+          <w:rFonts w:ascii="Aptos" w:eastAsia="Aptos" w:hAnsi="Aptos" w:cs="Aptos"/>
+        </w:rPr>
+        <w:t>api</w:t>
+      </w:r>
+      <w:proofErr w:type="spellEnd"/>
+      <w:r>
+        <w:rPr>
+          <w:rFonts w:ascii="Aptos" w:eastAsia="Aptos" w:hAnsi="Aptos" w:cs="Aptos"/>
+        </w:rPr>
+        <w:t xml:space="preserve"> key that costs real money) out of the web app.</w:t>
+      </w:r>
+      <w:r>
+        <w:rPr>
+          <w:rFonts w:ascii="Aptos" w:eastAsia="Aptos" w:hAnsi="Aptos" w:cs="Aptos"/>
+        </w:rPr>
+        <w:br/>
+      </w:r>
+      <w:r>
+        <w:rPr>
+          <w:rFonts w:ascii="Aptos" w:eastAsia="Aptos" w:hAnsi="Aptos" w:cs="Aptos"/>
+        </w:rPr>
+        <w:t>node scripts/run-</w:t>
+      </w:r>
+      <w:proofErr w:type="spellStart"/>
+      <w:r>
+        <w:rPr>
+          <w:rFonts w:ascii="Aptos" w:eastAsia="Aptos" w:hAnsi="Aptos" w:cs="Aptos"/>
+        </w:rPr>
+        <w:t>ingest.mjs</w:t>
+      </w:r>
+      <w:proofErr w:type="spellEnd"/>
+      <w:r>
+        <w:rPr>
+          <w:rFonts w:ascii="Aptos" w:eastAsia="Aptos" w:hAnsi="Aptos" w:cs="Aptos"/>
+        </w:rPr>
+        <w:t xml:space="preserve"> docs/sightings-newsletters/&lt;file&gt;.txt</w:t>
       </w:r>
     </w:p>
     <w:p>

</xml_diff>